<commit_message>
feat: complete MoneyTrace Phase 10.5 with real-time operations center, WebSocket live monitoring, fraud alert sirens, active user tracking, threat radar, emergency response workflows, and enhanced graph intelligence
</commit_message>
<xml_diff>
--- a/backend/storage/reports/docx/MoneyTrace_Dashboard_Summary_20260816.docx
+++ b/backend/storage/reports/docx/MoneyTrace_Dashboard_Summary_20260816.docx
@@ -12,7 +12,7 @@
     </w:p>
     <w:p>
       <w:r>
-        <w:t>Generated: 2026-08-16 07:46 UTC</w:t>
+        <w:t>Generated: 2026-08-16 17:57 UTC</w:t>
       </w:r>
     </w:p>
     <w:tbl>
@@ -69,7 +69,7 @@
           </w:tcPr>
           <w:p>
             <w:r>
-              <w:t>135 / 78</w:t>
+              <w:t>140 / 80</w:t>
             </w:r>
           </w:p>
         </w:tc>
@@ -119,7 +119,7 @@
           </w:tcPr>
           <w:p>
             <w:r>
-              <w:t>INR 10,576,027.00 / INR 1,915,013.00</w:t>
+              <w:t>INR 10,595,027.00 / INR 1,915,013.00</w:t>
             </w:r>
           </w:p>
         </w:tc>

</xml_diff>